<commit_message>
Update Phishing Email Detection.docx
</commit_message>
<xml_diff>
--- a/Phishing Email Detection.docx
+++ b/Phishing Email Detection.docx
@@ -235,11 +235,18 @@
         </w:rPr>
         <w:t>Cybersecurity Task 2: Future Interns</w:t>
       </w:r>
-      <w:bookmarkStart w:id="0" w:name="_GoBack"/>
-      <w:bookmarkEnd w:id="0"/>
     </w:p>
     <w:sdt>
       <w:sdtPr>
+        <w:rPr>
+          <w:rFonts w:asciiTheme="minorHAnsi" w:eastAsiaTheme="minorHAnsi" w:hAnsiTheme="minorHAnsi" w:cstheme="minorBidi"/>
+          <w:color w:val="auto"/>
+          <w:kern w:val="2"/>
+          <w:sz w:val="24"/>
+          <w:szCs w:val="24"/>
+          <w:lang w:val="en-AE"/>
+          <w14:ligatures w14:val="standardContextual"/>
+        </w:rPr>
         <w:id w:val="-340238117"/>
         <w:docPartObj>
           <w:docPartGallery w:val="Table of Contents"/>
@@ -248,16 +255,9 @@
       </w:sdtPr>
       <w:sdtEndPr>
         <w:rPr>
-          <w:rFonts w:asciiTheme="minorHAnsi" w:eastAsiaTheme="minorHAnsi" w:hAnsiTheme="minorHAnsi" w:cstheme="minorBidi"/>
           <w:b/>
           <w:bCs/>
           <w:noProof/>
-          <w:color w:val="auto"/>
-          <w:kern w:val="2"/>
-          <w:sz w:val="24"/>
-          <w:szCs w:val="24"/>
-          <w:lang w:val="en-AE"/>
-          <w14:ligatures w14:val="standardContextual"/>
         </w:rPr>
       </w:sdtEndPr>
       <w:sdtContent>
@@ -3831,8 +3831,8 @@
           <w:color w:val="auto"/>
         </w:rPr>
       </w:pPr>
-      <w:bookmarkStart w:id="1" w:name="_Toc233275914"/>
-      <w:bookmarkStart w:id="2" w:name="_Toc233278386"/>
+      <w:bookmarkStart w:id="0" w:name="_Toc233275914"/>
+      <w:bookmarkStart w:id="1" w:name="_Toc233278386"/>
       <w:r>
         <w:rPr>
           <w:rFonts w:ascii="Times New Roman" w:hAnsi="Times New Roman" w:cs="Times New Roman"/>
@@ -3842,8 +3842,8 @@
         <w:lastRenderedPageBreak/>
         <w:t>1. Executive Summary</w:t>
       </w:r>
+      <w:bookmarkEnd w:id="0"/>
       <w:bookmarkEnd w:id="1"/>
-      <w:bookmarkEnd w:id="2"/>
     </w:p>
     <w:p>
       <w:pPr>
@@ -3881,8 +3881,8 @@
           <w:color w:val="auto"/>
         </w:rPr>
       </w:pPr>
-      <w:bookmarkStart w:id="3" w:name="_Toc233275915"/>
-      <w:bookmarkStart w:id="4" w:name="_Toc233278387"/>
+      <w:bookmarkStart w:id="2" w:name="_Toc233275915"/>
+      <w:bookmarkStart w:id="3" w:name="_Toc233278387"/>
       <w:r>
         <w:rPr>
           <w:rFonts w:ascii="Times New Roman" w:hAnsi="Times New Roman" w:cs="Times New Roman"/>
@@ -3899,8 +3899,8 @@
         </w:rPr>
         <w:t>Introduction</w:t>
       </w:r>
+      <w:bookmarkEnd w:id="2"/>
       <w:bookmarkEnd w:id="3"/>
-      <w:bookmarkEnd w:id="4"/>
     </w:p>
     <w:p>
       <w:pPr>
@@ -3911,8 +3911,8 @@
           <w:color w:val="auto"/>
         </w:rPr>
       </w:pPr>
-      <w:bookmarkStart w:id="5" w:name="_Toc233275916"/>
-      <w:bookmarkStart w:id="6" w:name="_Toc233278388"/>
+      <w:bookmarkStart w:id="4" w:name="_Toc233275916"/>
+      <w:bookmarkStart w:id="5" w:name="_Toc233278388"/>
       <w:r>
         <w:rPr>
           <w:rFonts w:ascii="Times New Roman" w:hAnsi="Times New Roman" w:cs="Times New Roman"/>
@@ -3921,8 +3921,8 @@
         </w:rPr>
         <w:t>2.1 Objectives</w:t>
       </w:r>
+      <w:bookmarkEnd w:id="4"/>
       <w:bookmarkEnd w:id="5"/>
-      <w:bookmarkEnd w:id="6"/>
     </w:p>
     <w:p>
       <w:pPr>
@@ -4018,8 +4018,8 @@
           <w:color w:val="auto"/>
         </w:rPr>
       </w:pPr>
-      <w:bookmarkStart w:id="7" w:name="_Toc233275917"/>
-      <w:bookmarkStart w:id="8" w:name="_Toc233278389"/>
+      <w:bookmarkStart w:id="6" w:name="_Toc233275917"/>
+      <w:bookmarkStart w:id="7" w:name="_Toc233278389"/>
       <w:r>
         <w:rPr>
           <w:rFonts w:ascii="Times New Roman" w:hAnsi="Times New Roman" w:cs="Times New Roman"/>
@@ -4036,8 +4036,8 @@
         </w:rPr>
         <w:t xml:space="preserve"> Scope &amp; Methodology</w:t>
       </w:r>
+      <w:bookmarkEnd w:id="6"/>
       <w:bookmarkEnd w:id="7"/>
-      <w:bookmarkEnd w:id="8"/>
     </w:p>
     <w:p>
       <w:pPr>
@@ -4082,44 +4082,118 @@
     </w:p>
     <w:p>
       <w:pPr>
+        <w:jc w:val="both"/>
+        <w:rPr>
+          <w:rFonts w:ascii="Times New Roman" w:hAnsi="Times New Roman" w:cs="Times New Roman"/>
+        </w:rPr>
+      </w:pPr>
+    </w:p>
+    <w:p>
+      <w:pPr>
+        <w:jc w:val="both"/>
+        <w:rPr>
+          <w:rFonts w:ascii="Times New Roman" w:hAnsi="Times New Roman" w:cs="Times New Roman"/>
+        </w:rPr>
+      </w:pPr>
+    </w:p>
+    <w:p>
+      <w:pPr>
+        <w:jc w:val="both"/>
+        <w:rPr>
+          <w:rFonts w:ascii="Times New Roman" w:hAnsi="Times New Roman" w:cs="Times New Roman"/>
+        </w:rPr>
+      </w:pPr>
+    </w:p>
+    <w:p>
+      <w:pPr>
+        <w:jc w:val="both"/>
+        <w:rPr>
+          <w:rFonts w:ascii="Times New Roman" w:hAnsi="Times New Roman" w:cs="Times New Roman"/>
+        </w:rPr>
+      </w:pPr>
+    </w:p>
+    <w:p>
+      <w:pPr>
         <w:pStyle w:val="Heading3"/>
         <w:rPr>
           <w:sz w:val="28"/>
           <w:szCs w:val="28"/>
         </w:rPr>
       </w:pPr>
-      <w:bookmarkStart w:id="9" w:name="_Toc233275918"/>
-      <w:bookmarkStart w:id="10" w:name="_Toc233278390"/>
+      <w:bookmarkStart w:id="8" w:name="_Toc233275918"/>
+      <w:bookmarkStart w:id="9" w:name="_Toc233278390"/>
       <w:r>
         <w:rPr>
           <w:sz w:val="28"/>
           <w:szCs w:val="28"/>
         </w:rPr>
+        <w:lastRenderedPageBreak/>
         <w:t>2.3 Tools Used</w:t>
       </w:r>
+      <w:bookmarkEnd w:id="8"/>
       <w:bookmarkEnd w:id="9"/>
-      <w:bookmarkEnd w:id="10"/>
-    </w:p>
-    <w:p>
-      <w:pPr>
-        <w:rPr>
-          <w:rFonts w:ascii="Times New Roman" w:hAnsi="Times New Roman" w:cs="Times New Roman"/>
-        </w:rPr>
-      </w:pPr>
-    </w:p>
-    <w:p>
-      <w:pPr>
-        <w:rPr>
-          <w:rFonts w:ascii="Times New Roman" w:hAnsi="Times New Roman" w:cs="Times New Roman"/>
-        </w:rPr>
-      </w:pPr>
-    </w:p>
-    <w:p>
-      <w:pPr>
-        <w:rPr>
-          <w:rFonts w:ascii="Times New Roman" w:hAnsi="Times New Roman" w:cs="Times New Roman"/>
-        </w:rPr>
-      </w:pPr>
+    </w:p>
+    <w:p>
+      <w:pPr>
+        <w:pStyle w:val="Heading3"/>
+      </w:pPr>
+      <w:proofErr w:type="spellStart"/>
+      <w:r>
+        <w:t>MXToolbox</w:t>
+      </w:r>
+      <w:proofErr w:type="spellEnd"/>
+    </w:p>
+    <w:p>
+      <w:pPr>
+        <w:pStyle w:val="isselectedend"/>
+        <w:jc w:val="both"/>
+      </w:pPr>
+      <w:proofErr w:type="spellStart"/>
+      <w:r>
+        <w:t>MXToolbox</w:t>
+      </w:r>
+      <w:proofErr w:type="spellEnd"/>
+      <w:r>
+        <w:t xml:space="preserve"> was used to analyse email header information and investigate sender domains. The tool helps identify spoofing attempts, authentication failures, and domain-related issues that may indicate phishing activity.</w:t>
+      </w:r>
+    </w:p>
+    <w:p>
+      <w:pPr>
+        <w:jc w:val="both"/>
+        <w:rPr>
+          <w:rFonts w:ascii="Times New Roman" w:hAnsi="Times New Roman" w:cs="Times New Roman"/>
+          <w:b/>
+        </w:rPr>
+      </w:pPr>
+      <w:proofErr w:type="spellStart"/>
+      <w:r>
+        <w:rPr>
+          <w:rFonts w:ascii="Times New Roman" w:hAnsi="Times New Roman" w:cs="Times New Roman"/>
+          <w:b/>
+        </w:rPr>
+        <w:t>VirusTotal</w:t>
+      </w:r>
+      <w:proofErr w:type="spellEnd"/>
+    </w:p>
+    <w:p>
+      <w:pPr>
+        <w:pStyle w:val="NormalWeb"/>
+        <w:jc w:val="both"/>
+      </w:pPr>
+      <w:proofErr w:type="spellStart"/>
+      <w:r>
+        <w:t>VirusTotal</w:t>
+      </w:r>
+      <w:proofErr w:type="spellEnd"/>
+      <w:r>
+        <w:t xml:space="preserve"> was used to analyse suspicious domains, URLs, and phishing indicators. The platform aggregates </w:t>
+      </w:r>
+      <w:r>
+        <w:t>result</w:t>
+      </w:r>
+      <w:r>
+        <w:t xml:space="preserve"> from multiple security vendors and threat intelligence sources to identify potentially malicious content.</w:t>
+      </w:r>
     </w:p>
     <w:p>
       <w:pPr>
@@ -4131,19 +4205,18 @@
           <w:color w:val="auto"/>
         </w:rPr>
       </w:pPr>
-      <w:bookmarkStart w:id="11" w:name="_Toc233275919"/>
-      <w:bookmarkStart w:id="12" w:name="_Toc233278391"/>
+      <w:bookmarkStart w:id="10" w:name="_Toc233275919"/>
+      <w:bookmarkStart w:id="11" w:name="_Toc233278391"/>
       <w:r>
         <w:rPr>
           <w:rFonts w:ascii="Times New Roman" w:hAnsi="Times New Roman" w:cs="Times New Roman"/>
           <w:b/>
           <w:color w:val="auto"/>
         </w:rPr>
-        <w:lastRenderedPageBreak/>
         <w:t>2.4 Ethical Considerations</w:t>
       </w:r>
+      <w:bookmarkEnd w:id="10"/>
       <w:bookmarkEnd w:id="11"/>
-      <w:bookmarkEnd w:id="12"/>
     </w:p>
     <w:p>
       <w:pPr>
@@ -4287,8 +4360,8 @@
           <w:color w:val="auto"/>
         </w:rPr>
       </w:pPr>
-      <w:bookmarkStart w:id="13" w:name="_Toc233275920"/>
-      <w:bookmarkStart w:id="14" w:name="_Toc233278392"/>
+      <w:bookmarkStart w:id="12" w:name="_Toc233275920"/>
+      <w:bookmarkStart w:id="13" w:name="_Toc233278392"/>
       <w:r>
         <w:rPr>
           <w:rFonts w:ascii="Times New Roman" w:hAnsi="Times New Roman" w:cs="Times New Roman"/>
@@ -4297,8 +4370,8 @@
         </w:rPr>
         <w:t>3. Common Phishing Indicators</w:t>
       </w:r>
+      <w:bookmarkEnd w:id="12"/>
       <w:bookmarkEnd w:id="13"/>
-      <w:bookmarkEnd w:id="14"/>
       <w:r>
         <w:rPr>
           <w:rFonts w:ascii="Times New Roman" w:hAnsi="Times New Roman" w:cs="Times New Roman"/>
@@ -4887,14 +4960,15 @@
           <w:color w:val="auto"/>
         </w:rPr>
       </w:pPr>
-      <w:bookmarkStart w:id="15" w:name="_Toc233275921"/>
-      <w:bookmarkStart w:id="16" w:name="_Toc233278393"/>
+      <w:bookmarkStart w:id="14" w:name="_Toc233275921"/>
+      <w:bookmarkStart w:id="15" w:name="_Toc233278393"/>
       <w:r>
         <w:rPr>
           <w:rFonts w:ascii="Times New Roman" w:hAnsi="Times New Roman" w:cs="Times New Roman"/>
           <w:b/>
           <w:color w:val="auto"/>
         </w:rPr>
+        <w:lastRenderedPageBreak/>
         <w:t xml:space="preserve">4. Phishing Email </w:t>
       </w:r>
       <w:r>
@@ -4905,8 +4979,8 @@
         </w:rPr>
         <w:t>Analysis</w:t>
       </w:r>
+      <w:bookmarkEnd w:id="14"/>
       <w:bookmarkEnd w:id="15"/>
-      <w:bookmarkEnd w:id="16"/>
     </w:p>
     <w:p>
       <w:pPr>
@@ -4919,8 +4993,8 @@
           <w:color w:val="auto"/>
         </w:rPr>
       </w:pPr>
-      <w:bookmarkStart w:id="17" w:name="_Toc233275922"/>
-      <w:bookmarkStart w:id="18" w:name="_Toc233278394"/>
+      <w:bookmarkStart w:id="16" w:name="_Toc233275922"/>
+      <w:bookmarkStart w:id="17" w:name="_Toc233278394"/>
       <w:r>
         <w:rPr>
           <w:rFonts w:ascii="Times New Roman" w:hAnsi="Times New Roman" w:cs="Times New Roman"/>
@@ -4945,8 +5019,8 @@
         </w:rPr>
         <w:t>DHL Shipping Invoice</w:t>
       </w:r>
+      <w:bookmarkEnd w:id="16"/>
       <w:bookmarkEnd w:id="17"/>
-      <w:bookmarkEnd w:id="18"/>
     </w:p>
     <w:p>
       <w:pPr>
@@ -5016,42 +5090,23 @@
     </w:p>
     <w:p>
       <w:pPr>
-        <w:spacing w:after="240" w:line="240" w:lineRule="auto"/>
-        <w:jc w:val="both"/>
-        <w:rPr>
-          <w:rFonts w:ascii="Times New Roman" w:hAnsi="Times New Roman" w:cs="Times New Roman"/>
-        </w:rPr>
-      </w:pPr>
-    </w:p>
-    <w:p>
-      <w:pPr>
-        <w:spacing w:after="240" w:line="240" w:lineRule="auto"/>
-        <w:jc w:val="both"/>
-        <w:rPr>
-          <w:rFonts w:ascii="Times New Roman" w:hAnsi="Times New Roman" w:cs="Times New Roman"/>
-        </w:rPr>
-      </w:pPr>
-    </w:p>
-    <w:p>
-      <w:pPr>
         <w:pStyle w:val="Heading3"/>
         <w:rPr>
           <w:sz w:val="24"/>
           <w:szCs w:val="24"/>
         </w:rPr>
       </w:pPr>
-      <w:bookmarkStart w:id="19" w:name="_Toc233275923"/>
-      <w:bookmarkStart w:id="20" w:name="_Toc233278395"/>
+      <w:bookmarkStart w:id="18" w:name="_Toc233275923"/>
+      <w:bookmarkStart w:id="19" w:name="_Toc233278395"/>
       <w:r>
         <w:rPr>
           <w:sz w:val="24"/>
           <w:szCs w:val="24"/>
         </w:rPr>
-        <w:lastRenderedPageBreak/>
         <w:t>4.1.1 Phishing Email Sample</w:t>
       </w:r>
+      <w:bookmarkEnd w:id="18"/>
       <w:bookmarkEnd w:id="19"/>
-      <w:bookmarkEnd w:id="20"/>
     </w:p>
     <w:p>
       <w:pPr>
@@ -5134,19 +5189,52 @@
     </w:p>
     <w:p>
       <w:pPr>
+        <w:jc w:val="both"/>
+        <w:rPr>
+          <w:rFonts w:ascii="Times New Roman" w:hAnsi="Times New Roman" w:cs="Times New Roman"/>
+        </w:rPr>
+      </w:pPr>
+    </w:p>
+    <w:p>
+      <w:pPr>
+        <w:jc w:val="both"/>
+        <w:rPr>
+          <w:rFonts w:ascii="Times New Roman" w:hAnsi="Times New Roman" w:cs="Times New Roman"/>
+        </w:rPr>
+      </w:pPr>
+    </w:p>
+    <w:p>
+      <w:pPr>
+        <w:jc w:val="both"/>
+        <w:rPr>
+          <w:rFonts w:ascii="Times New Roman" w:hAnsi="Times New Roman" w:cs="Times New Roman"/>
+        </w:rPr>
+      </w:pPr>
+    </w:p>
+    <w:p>
+      <w:pPr>
+        <w:jc w:val="both"/>
+        <w:rPr>
+          <w:rFonts w:ascii="Times New Roman" w:hAnsi="Times New Roman" w:cs="Times New Roman"/>
+        </w:rPr>
+      </w:pPr>
+    </w:p>
+    <w:p>
+      <w:pPr>
         <w:pStyle w:val="Heading3"/>
         <w:rPr>
           <w:sz w:val="24"/>
           <w:szCs w:val="24"/>
         </w:rPr>
       </w:pPr>
-      <w:bookmarkStart w:id="21" w:name="_Toc233275924"/>
-      <w:bookmarkStart w:id="22" w:name="_Toc233278396"/>
+      <w:bookmarkStart w:id="20" w:name="_Toc233275924"/>
+      <w:bookmarkStart w:id="21" w:name="_Toc233278396"/>
       <w:r>
         <w:rPr>
           <w:sz w:val="24"/>
           <w:szCs w:val="24"/>
         </w:rPr>
+        <w:lastRenderedPageBreak/>
         <w:t>4.1.2 Email Header Analysis (</w:t>
       </w:r>
       <w:proofErr w:type="spellStart"/>
@@ -5165,8 +5253,8 @@
         </w:rPr>
         <w:t>)</w:t>
       </w:r>
+      <w:bookmarkEnd w:id="20"/>
       <w:bookmarkEnd w:id="21"/>
-      <w:bookmarkEnd w:id="22"/>
     </w:p>
     <w:p>
       <w:pPr>
@@ -5239,7 +5327,6 @@
       </w:pPr>
       <w:proofErr w:type="spellStart"/>
       <w:r>
-        <w:lastRenderedPageBreak/>
         <w:t>MXToolbox</w:t>
       </w:r>
       <w:proofErr w:type="spellEnd"/>
@@ -5286,6 +5373,8 @@
         <w:t xml:space="preserve"> results provided strong evidence that the email originated from an untrusted source and should be classified as a phishing attempt.</w:t>
       </w:r>
     </w:p>
+    <w:bookmarkStart w:id="22" w:name="_Toc233275925"/>
+    <w:bookmarkStart w:id="23" w:name="_Toc233278397"/>
     <w:p>
       <w:pPr>
         <w:pStyle w:val="Heading3"/>
@@ -5294,14 +5383,13 @@
           <w:szCs w:val="24"/>
         </w:rPr>
       </w:pPr>
-      <w:bookmarkStart w:id="23" w:name="_Toc233275925"/>
-      <w:bookmarkStart w:id="24" w:name="_Toc233278397"/>
       <w:r>
         <w:rPr>
           <w:noProof/>
           <w:sz w:val="24"/>
           <w:szCs w:val="24"/>
         </w:rPr>
+        <w:lastRenderedPageBreak/>
         <mc:AlternateContent>
           <mc:Choice Requires="wps">
             <w:drawing>
@@ -5454,8 +5542,8 @@
           </wp:inline>
         </w:drawing>
       </w:r>
+      <w:bookmarkEnd w:id="22"/>
       <w:bookmarkEnd w:id="23"/>
-      <w:bookmarkEnd w:id="24"/>
     </w:p>
     <w:p>
       <w:pPr>
@@ -5526,18 +5614,17 @@
           <w:szCs w:val="24"/>
         </w:rPr>
       </w:pPr>
-      <w:bookmarkStart w:id="25" w:name="_Toc233275926"/>
-      <w:bookmarkStart w:id="26" w:name="_Toc233278398"/>
+      <w:bookmarkStart w:id="24" w:name="_Toc233275926"/>
+      <w:bookmarkStart w:id="25" w:name="_Toc233278398"/>
       <w:r>
         <w:rPr>
           <w:sz w:val="24"/>
           <w:szCs w:val="24"/>
         </w:rPr>
-        <w:lastRenderedPageBreak/>
         <w:t>4.1.3 Identified Phishing Indicators</w:t>
       </w:r>
+      <w:bookmarkEnd w:id="24"/>
       <w:bookmarkEnd w:id="25"/>
-      <w:bookmarkEnd w:id="26"/>
     </w:p>
     <w:tbl>
       <w:tblPr>
@@ -6056,8 +6143,8 @@
           <w:szCs w:val="24"/>
         </w:rPr>
       </w:pPr>
-      <w:bookmarkStart w:id="27" w:name="_Toc233275927"/>
-      <w:bookmarkStart w:id="28" w:name="_Toc233278399"/>
+      <w:bookmarkStart w:id="26" w:name="_Toc233275927"/>
+      <w:bookmarkStart w:id="27" w:name="_Toc233278399"/>
       <w:r>
         <w:rPr>
           <w:sz w:val="24"/>
@@ -6065,8 +6152,8 @@
         </w:rPr>
         <w:t>4.1.4 Phishing Attack Mechanism</w:t>
       </w:r>
+      <w:bookmarkEnd w:id="26"/>
       <w:bookmarkEnd w:id="27"/>
-      <w:bookmarkEnd w:id="28"/>
     </w:p>
     <w:p>
       <w:pPr>
@@ -6087,12 +6174,13 @@
       <w:pPr>
         <w:pStyle w:val="Heading3"/>
       </w:pPr>
-      <w:bookmarkStart w:id="29" w:name="_Toc233275928"/>
-      <w:bookmarkStart w:id="30" w:name="_Toc233278400"/>
+      <w:bookmarkStart w:id="28" w:name="_Toc233275928"/>
+      <w:bookmarkStart w:id="29" w:name="_Toc233278400"/>
       <w:r>
         <w:rPr>
           <w:sz w:val="24"/>
         </w:rPr>
+        <w:lastRenderedPageBreak/>
         <w:t>4.1.</w:t>
       </w:r>
       <w:r>
@@ -6107,8 +6195,8 @@
         </w:rPr>
         <w:t xml:space="preserve"> Potential Security Impact</w:t>
       </w:r>
+      <w:bookmarkEnd w:id="28"/>
       <w:bookmarkEnd w:id="29"/>
-      <w:bookmarkEnd w:id="30"/>
     </w:p>
     <w:p>
       <w:pPr>
@@ -6182,8 +6270,8 @@
           <w:sz w:val="24"/>
         </w:rPr>
       </w:pPr>
-      <w:bookmarkStart w:id="31" w:name="_Toc233275929"/>
-      <w:bookmarkStart w:id="32" w:name="_Toc233278401"/>
+      <w:bookmarkStart w:id="30" w:name="_Toc233275929"/>
+      <w:bookmarkStart w:id="31" w:name="_Toc233278401"/>
       <w:r>
         <w:rPr>
           <w:sz w:val="24"/>
@@ -6202,8 +6290,8 @@
         </w:rPr>
         <w:t xml:space="preserve"> Security Recommendations</w:t>
       </w:r>
+      <w:bookmarkEnd w:id="30"/>
       <w:bookmarkEnd w:id="31"/>
-      <w:bookmarkEnd w:id="32"/>
     </w:p>
     <w:p>
       <w:pPr>
@@ -6279,8 +6367,8 @@
           <w:color w:val="auto"/>
         </w:rPr>
       </w:pPr>
-      <w:bookmarkStart w:id="33" w:name="_Toc233275930"/>
-      <w:bookmarkStart w:id="34" w:name="_Toc233278402"/>
+      <w:bookmarkStart w:id="32" w:name="_Toc233275930"/>
+      <w:bookmarkStart w:id="33" w:name="_Toc233278402"/>
       <w:r>
         <w:rPr>
           <w:rFonts w:ascii="Times New Roman" w:hAnsi="Times New Roman" w:cs="Times New Roman"/>
@@ -6289,8 +6377,8 @@
         </w:rPr>
         <w:t>4.2 Sample 2:  Human Resources Department Email</w:t>
       </w:r>
+      <w:bookmarkEnd w:id="32"/>
       <w:bookmarkEnd w:id="33"/>
-      <w:bookmarkEnd w:id="34"/>
     </w:p>
     <w:p>
       <w:pPr>
@@ -6330,53 +6418,35 @@
     </w:p>
     <w:p>
       <w:pPr>
-        <w:pStyle w:val="NormalWeb"/>
+        <w:pStyle w:val="Heading3"/>
+        <w:rPr>
+          <w:sz w:val="24"/>
+        </w:rPr>
+      </w:pPr>
+      <w:bookmarkStart w:id="34" w:name="_Toc233275931"/>
+      <w:bookmarkStart w:id="35" w:name="_Toc233278403"/>
+      <w:r>
+        <w:rPr>
+          <w:sz w:val="24"/>
+        </w:rPr>
+        <w:t>4.2.1 Phishing Email Sample</w:t>
+      </w:r>
+      <w:bookmarkEnd w:id="34"/>
+      <w:bookmarkEnd w:id="35"/>
+    </w:p>
+    <w:p>
+      <w:pPr>
         <w:jc w:val="both"/>
-      </w:pPr>
-    </w:p>
-    <w:p>
-      <w:pPr>
-        <w:pStyle w:val="NormalWeb"/>
-        <w:jc w:val="both"/>
-      </w:pPr>
-    </w:p>
-    <w:p>
-      <w:pPr>
-        <w:pStyle w:val="NormalWeb"/>
-        <w:jc w:val="both"/>
-      </w:pPr>
-    </w:p>
-    <w:p>
-      <w:pPr>
-        <w:pStyle w:val="Heading3"/>
-        <w:rPr>
-          <w:sz w:val="24"/>
-        </w:rPr>
-      </w:pPr>
-      <w:bookmarkStart w:id="35" w:name="_Toc233275931"/>
-      <w:bookmarkStart w:id="36" w:name="_Toc233278403"/>
-      <w:r>
-        <w:rPr>
-          <w:sz w:val="24"/>
+        <w:rPr>
+          <w:rFonts w:ascii="Times New Roman" w:hAnsi="Times New Roman" w:cs="Times New Roman"/>
+        </w:rPr>
+      </w:pPr>
+      <w:r>
+        <w:rPr>
+          <w:rFonts w:ascii="Times New Roman" w:hAnsi="Times New Roman" w:cs="Times New Roman"/>
+          <w:noProof/>
         </w:rPr>
         <w:lastRenderedPageBreak/>
-        <w:t>4.2.1 Phishing Email Sample</w:t>
-      </w:r>
-      <w:bookmarkEnd w:id="35"/>
-      <w:bookmarkEnd w:id="36"/>
-    </w:p>
-    <w:p>
-      <w:pPr>
-        <w:jc w:val="both"/>
-        <w:rPr>
-          <w:rFonts w:ascii="Times New Roman" w:hAnsi="Times New Roman" w:cs="Times New Roman"/>
-        </w:rPr>
-      </w:pPr>
-      <w:r>
-        <w:rPr>
-          <w:rFonts w:ascii="Times New Roman" w:hAnsi="Times New Roman" w:cs="Times New Roman"/>
-          <w:noProof/>
-        </w:rPr>
         <w:drawing>
           <wp:inline distT="0" distB="0" distL="0" distR="0">
             <wp:extent cx="5680364" cy="4358929"/>
@@ -6451,8 +6521,8 @@
           <w:sz w:val="24"/>
         </w:rPr>
       </w:pPr>
-      <w:bookmarkStart w:id="37" w:name="_Toc233275932"/>
-      <w:bookmarkStart w:id="38" w:name="_Toc233278404"/>
+      <w:bookmarkStart w:id="36" w:name="_Toc233275932"/>
+      <w:bookmarkStart w:id="37" w:name="_Toc233278404"/>
       <w:r>
         <w:rPr>
           <w:sz w:val="24"/>
@@ -6473,8 +6543,8 @@
         </w:rPr>
         <w:t>)</w:t>
       </w:r>
+      <w:bookmarkEnd w:id="36"/>
       <w:bookmarkEnd w:id="37"/>
-      <w:bookmarkEnd w:id="38"/>
     </w:p>
     <w:p>
       <w:pPr>
@@ -6550,11 +6620,11 @@
       </w:r>
       <w:proofErr w:type="spellEnd"/>
       <w:r>
-        <w:t xml:space="preserve"> was used to analyse the email header information and verify the legitimacy of the sender. The header analysis revealed that the email was sent from a domain that was not </w:t>
+        <w:t xml:space="preserve"> was used to analyse the email header information and verify the legitimacy of the sender. The header analysis revealed that the email was sent from a domain that was not associated with the organisation's official Human Resources department. While the email appeared to be an internal communication regarding a work survey, the sender information </w:t>
       </w:r>
       <w:r>
         <w:lastRenderedPageBreak/>
-        <w:t>associated with the organisation's official Human Resources department. While the email appeared to be an internal communication regarding a work survey, the sender information showed inconsistencies that raised suspicion. The analysis also identified authentication issues, including missing or failed SPF, DKIM, and DMARC records, which are commonly used to verify whether an email originates from a legitimate source.</w:t>
+        <w:t>showed inconsistencies that raised suspicion. The analysis also identified authentication issues, including missing or failed SPF, DKIM, and DMARC records, which are commonly used to verify whether an email originates from a legitimate source.</w:t>
       </w:r>
     </w:p>
     <w:p>
@@ -6582,6 +6652,8 @@
         <w:t>.</w:t>
       </w:r>
     </w:p>
+    <w:bookmarkStart w:id="38" w:name="_Toc233275933"/>
+    <w:bookmarkStart w:id="39" w:name="_Toc233278405"/>
     <w:p>
       <w:pPr>
         <w:pStyle w:val="Heading3"/>
@@ -6590,8 +6662,6 @@
           <w:sz w:val="24"/>
         </w:rPr>
       </w:pPr>
-      <w:bookmarkStart w:id="39" w:name="_Toc233275933"/>
-      <w:bookmarkStart w:id="40" w:name="_Toc233278405"/>
       <w:r>
         <w:rPr>
           <w:noProof/>
@@ -6689,8 +6759,8 @@
         </w:rPr>
         <w:t>)</w:t>
       </w:r>
+      <w:bookmarkEnd w:id="38"/>
       <w:bookmarkEnd w:id="39"/>
-      <w:bookmarkEnd w:id="40"/>
     </w:p>
     <w:p>
       <w:r>
@@ -6884,17 +6954,16 @@
           <w:sz w:val="24"/>
         </w:rPr>
       </w:pPr>
-      <w:bookmarkStart w:id="41" w:name="_Toc233275934"/>
-      <w:bookmarkStart w:id="42" w:name="_Toc233278406"/>
+      <w:bookmarkStart w:id="40" w:name="_Toc233275934"/>
+      <w:bookmarkStart w:id="41" w:name="_Toc233278406"/>
       <w:r>
         <w:rPr>
           <w:sz w:val="24"/>
         </w:rPr>
-        <w:lastRenderedPageBreak/>
         <w:t>4.2.3 Identified Phishing Indicators</w:t>
       </w:r>
+      <w:bookmarkEnd w:id="40"/>
       <w:bookmarkEnd w:id="41"/>
-      <w:bookmarkEnd w:id="42"/>
     </w:p>
     <w:tbl>
       <w:tblPr>
@@ -6931,6 +7000,7 @@
                 <w:b/>
                 <w:bCs/>
               </w:rPr>
+              <w:lastRenderedPageBreak/>
               <w:t>Indicator</w:t>
             </w:r>
           </w:p>
@@ -7322,16 +7392,16 @@
           <w:sz w:val="24"/>
         </w:rPr>
       </w:pPr>
-      <w:bookmarkStart w:id="43" w:name="_Toc233275935"/>
-      <w:bookmarkStart w:id="44" w:name="_Toc233278407"/>
+      <w:bookmarkStart w:id="42" w:name="_Toc233275935"/>
+      <w:bookmarkStart w:id="43" w:name="_Toc233278407"/>
       <w:r>
         <w:rPr>
           <w:sz w:val="24"/>
         </w:rPr>
         <w:t>4.2.4 Phishing Attack Mechanism</w:t>
       </w:r>
+      <w:bookmarkEnd w:id="42"/>
       <w:bookmarkEnd w:id="43"/>
-      <w:bookmarkEnd w:id="44"/>
     </w:p>
     <w:p>
       <w:pPr>
@@ -7355,8 +7425,8 @@
           <w:sz w:val="24"/>
         </w:rPr>
       </w:pPr>
-      <w:bookmarkStart w:id="45" w:name="_Toc233275936"/>
-      <w:bookmarkStart w:id="46" w:name="_Toc233278408"/>
+      <w:bookmarkStart w:id="44" w:name="_Toc233275936"/>
+      <w:bookmarkStart w:id="45" w:name="_Toc233278408"/>
       <w:r>
         <w:rPr>
           <w:sz w:val="24"/>
@@ -7375,8 +7445,8 @@
         </w:rPr>
         <w:t>Potential Security Impact</w:t>
       </w:r>
+      <w:bookmarkEnd w:id="44"/>
       <w:bookmarkEnd w:id="45"/>
-      <w:bookmarkEnd w:id="46"/>
     </w:p>
     <w:p>
       <w:pPr>
@@ -7480,8 +7550,8 @@
           <w:sz w:val="24"/>
         </w:rPr>
       </w:pPr>
-      <w:bookmarkStart w:id="47" w:name="_Toc233275937"/>
-      <w:bookmarkStart w:id="48" w:name="_Toc233278409"/>
+      <w:bookmarkStart w:id="46" w:name="_Toc233275937"/>
+      <w:bookmarkStart w:id="47" w:name="_Toc233278409"/>
       <w:r>
         <w:rPr>
           <w:sz w:val="24"/>
@@ -7500,8 +7570,8 @@
         </w:rPr>
         <w:t xml:space="preserve"> Security Recommendations</w:t>
       </w:r>
+      <w:bookmarkEnd w:id="46"/>
       <w:bookmarkEnd w:id="47"/>
-      <w:bookmarkEnd w:id="48"/>
     </w:p>
     <w:p>
       <w:pPr>
@@ -7577,8 +7647,8 @@
           <w:color w:val="auto"/>
         </w:rPr>
       </w:pPr>
-      <w:bookmarkStart w:id="49" w:name="_Toc233275938"/>
-      <w:bookmarkStart w:id="50" w:name="_Toc233278410"/>
+      <w:bookmarkStart w:id="48" w:name="_Toc233275938"/>
+      <w:bookmarkStart w:id="49" w:name="_Toc233278410"/>
       <w:r>
         <w:rPr>
           <w:rFonts w:ascii="Times New Roman" w:hAnsi="Times New Roman" w:cs="Times New Roman"/>
@@ -7635,8 +7705,8 @@
         </w:rPr>
         <w:t>Notification</w:t>
       </w:r>
+      <w:bookmarkEnd w:id="48"/>
       <w:bookmarkEnd w:id="49"/>
-      <w:bookmarkEnd w:id="50"/>
     </w:p>
     <w:p>
       <w:pPr>
@@ -7700,13 +7770,19 @@
     </w:p>
     <w:p>
       <w:pPr>
+        <w:pStyle w:val="NormalWeb"/>
+        <w:jc w:val="both"/>
+      </w:pPr>
+    </w:p>
+    <w:p>
+      <w:pPr>
         <w:pStyle w:val="Heading3"/>
         <w:rPr>
           <w:sz w:val="24"/>
         </w:rPr>
       </w:pPr>
-      <w:bookmarkStart w:id="51" w:name="_Toc233275939"/>
-      <w:bookmarkStart w:id="52" w:name="_Toc233278411"/>
+      <w:bookmarkStart w:id="50" w:name="_Toc233275939"/>
+      <w:bookmarkStart w:id="51" w:name="_Toc233278411"/>
       <w:r>
         <w:rPr>
           <w:sz w:val="24"/>
@@ -7726,8 +7802,8 @@
         </w:rPr>
         <w:t>.1 Phishing Email Sample</w:t>
       </w:r>
+      <w:bookmarkEnd w:id="50"/>
       <w:bookmarkEnd w:id="51"/>
-      <w:bookmarkEnd w:id="52"/>
     </w:p>
     <w:p>
       <w:pPr>
@@ -7812,8 +7888,8 @@
       <w:pPr>
         <w:pStyle w:val="Heading3"/>
       </w:pPr>
-      <w:bookmarkStart w:id="53" w:name="_Toc233275940"/>
-      <w:bookmarkStart w:id="54" w:name="_Toc233278412"/>
+      <w:bookmarkStart w:id="52" w:name="_Toc233275940"/>
+      <w:bookmarkStart w:id="53" w:name="_Toc233278412"/>
       <w:r>
         <w:rPr>
           <w:sz w:val="24"/>
@@ -7846,8 +7922,8 @@
         </w:rPr>
         <w:t>)</w:t>
       </w:r>
+      <w:bookmarkEnd w:id="52"/>
       <w:bookmarkEnd w:id="53"/>
-      <w:bookmarkEnd w:id="54"/>
     </w:p>
     <w:p>
       <w:pPr>
@@ -7965,8 +8041,8 @@
           <w:sz w:val="24"/>
         </w:rPr>
       </w:pPr>
-      <w:bookmarkStart w:id="55" w:name="_Toc233275941"/>
-      <w:bookmarkStart w:id="56" w:name="_Toc233278413"/>
+      <w:bookmarkStart w:id="54" w:name="_Toc233275941"/>
+      <w:bookmarkStart w:id="55" w:name="_Toc233278413"/>
       <w:r>
         <w:rPr>
           <w:sz w:val="24"/>
@@ -7999,8 +8075,8 @@
         </w:rPr>
         <w:t>)</w:t>
       </w:r>
+      <w:bookmarkEnd w:id="54"/>
       <w:bookmarkEnd w:id="55"/>
-      <w:bookmarkEnd w:id="56"/>
     </w:p>
     <w:p>
       <w:r>
@@ -8221,15 +8297,8 @@
           <w:lang w:eastAsia="en-AE"/>
         </w:rPr>
       </w:pPr>
-    </w:p>
-    <w:p>
-      <w:pPr>
-        <w:jc w:val="both"/>
-        <w:rPr>
-          <w:rFonts w:ascii="Times New Roman" w:hAnsi="Times New Roman" w:cs="Times New Roman"/>
-          <w:lang w:eastAsia="en-AE"/>
-        </w:rPr>
-      </w:pPr>
+      <w:bookmarkStart w:id="56" w:name="_GoBack"/>
+      <w:bookmarkEnd w:id="56"/>
     </w:p>
     <w:p>
       <w:pPr>
@@ -8244,6 +8313,7 @@
         <w:rPr>
           <w:sz w:val="24"/>
         </w:rPr>
+        <w:lastRenderedPageBreak/>
         <w:t>4.</w:t>
       </w:r>
       <w:r>
@@ -9203,7 +9273,6 @@
         <w:rPr>
           <w:sz w:val="24"/>
         </w:rPr>
-        <w:lastRenderedPageBreak/>
         <w:t>4.</w:t>
       </w:r>
       <w:r>
@@ -9233,6 +9302,7 @@
           <w:rFonts w:ascii="Times New Roman" w:hAnsi="Times New Roman" w:cs="Times New Roman"/>
           <w:noProof/>
         </w:rPr>
+        <w:lastRenderedPageBreak/>
         <w:drawing>
           <wp:inline distT="0" distB="0" distL="0" distR="0">
             <wp:extent cx="5676900" cy="4347825"/>
@@ -9474,6 +9544,8 @@
         <w:t xml:space="preserve"> provide strong evidence that the message was not sent by a genuine banking organisation.</w:t>
       </w:r>
     </w:p>
+    <w:bookmarkStart w:id="71" w:name="_Toc233275949"/>
+    <w:bookmarkStart w:id="72" w:name="_Toc233278421"/>
     <w:p>
       <w:pPr>
         <w:pStyle w:val="Heading3"/>
@@ -9481,8 +9553,6 @@
           <w:noProof/>
         </w:rPr>
       </w:pPr>
-      <w:bookmarkStart w:id="71" w:name="_Toc233275949"/>
-      <w:bookmarkStart w:id="72" w:name="_Toc233278421"/>
       <w:r>
         <w:rPr>
           <w:noProof/>
@@ -13683,7 +13753,6 @@
     <w:name w:val="Normal (Web)"/>
     <w:basedOn w:val="Normal"/>
     <w:uiPriority w:val="99"/>
-    <w:semiHidden/>
     <w:unhideWhenUsed/>
     <w:rsid w:val="00C928F3"/>
     <w:pPr>
@@ -14179,7 +14248,7 @@
 </file>
 
 <file path=customXml/itemProps1.xml><?xml version="1.0" encoding="utf-8"?>
-<ds:datastoreItem xmlns:ds="http://schemas.openxmlformats.org/officeDocument/2006/customXml" ds:itemID="{E7BEE9C6-3FD0-42D9-8606-FB3E77EAC656}">
+<ds:datastoreItem xmlns:ds="http://schemas.openxmlformats.org/officeDocument/2006/customXml" ds:itemID="{833DCB5F-CEA5-49D3-B27C-81DF387F52C4}">
   <ds:schemaRefs>
     <ds:schemaRef ds:uri="http://schemas.openxmlformats.org/officeDocument/2006/bibliography"/>
   </ds:schemaRefs>

</xml_diff>